<commit_message>
Add supapase into require
</commit_message>
<xml_diff>
--- a/BÁO CÁO TIẾN ĐỘ ĐỒ ÁN TỐT NGHIỆP_THONGTHIEN.docx
+++ b/BÁO CÁO TIẾN ĐỘ ĐỒ ÁN TỐT NGHIỆP_THONGTHIEN.docx
@@ -26,42 +26,7 @@
     </w:p>
     <w:p>
       <w:pPr>
-        <w:pStyle w:val="Heading1"/>
         <w:jc w:val="center"/>
-        <w:rPr>
-          <w:color w:val="FF0000"/>
-        </w:rPr>
-      </w:pPr>
-      <w:r>
-        <w:rPr>
-          <w:color w:val="FF0000"/>
-        </w:rPr>
-        <w:t>(1</w:t>
-      </w:r>
-      <w:r>
-        <w:rPr>
-          <w:color w:val="FF0000"/>
-          <w:lang w:val="vi-VN"/>
-        </w:rPr>
-        <w:t>4</w:t>
-      </w:r>
-      <w:r>
-        <w:rPr>
-          <w:color w:val="FF0000"/>
-        </w:rPr>
-        <w:t>/3/2026)</w:t>
-      </w:r>
-    </w:p>
-    <w:p>
-      <w:pPr>
-        <w:jc w:val="both"/>
-        <w:rPr>
-          <w:rFonts w:ascii="Times New Roman" w:hAnsi="Times New Roman" w:cs="Times New Roman"/>
-          <w:sz w:val="32"/>
-          <w:szCs w:val="32"/>
-        </w:rPr>
-      </w:pPr>
-      <w:r>
         <w:rPr>
           <w:rFonts w:ascii="Times New Roman" w:hAnsi="Times New Roman" w:cs="Times New Roman"/>
           <w:b/>
@@ -69,15 +34,44 @@
           <w:sz w:val="32"/>
           <w:szCs w:val="32"/>
         </w:rPr>
-        <w:t>Đề tài:</w:t>
-      </w:r>
-      <w:r>
-        <w:rPr>
-          <w:rFonts w:ascii="Times New Roman" w:hAnsi="Times New Roman" w:cs="Times New Roman"/>
+      </w:pPr>
+      <w:r>
+        <w:rPr>
+          <w:rFonts w:ascii="Times New Roman" w:hAnsi="Times New Roman" w:cs="Times New Roman"/>
+          <w:b/>
+          <w:bCs/>
           <w:sz w:val="32"/>
           <w:szCs w:val="32"/>
         </w:rPr>
-        <w:t xml:space="preserve"> Hệ thống dự đoán tỷ lệ mỡ cơ thể (Body Fat) qua hình ảnh sử dụng Computer Vision và Machine Learning.</w:t>
+        <w:t>Đề tài: Hệ thống dự đoán tỷ lệ mỡ cơ thể (Body Fat) qua hình ảnh sử dụng Computer Vision và Machine Learning.</w:t>
+      </w:r>
+    </w:p>
+    <w:p>
+      <w:pPr>
+        <w:pStyle w:val="Heading1"/>
+        <w:jc w:val="center"/>
+        <w:rPr>
+          <w:color w:val="FF0000"/>
+        </w:rPr>
+      </w:pPr>
+      <w:r>
+        <w:rPr>
+          <w:color w:val="FF0000"/>
+        </w:rPr>
+        <w:t>(1</w:t>
+      </w:r>
+      <w:r>
+        <w:rPr>
+          <w:color w:val="FF0000"/>
+          <w:lang w:val="vi-VN"/>
+        </w:rPr>
+        <w:t>4</w:t>
+      </w:r>
+      <w:r>
+        <w:rPr>
+          <w:color w:val="FF0000"/>
+        </w:rPr>
+        <w:t>/3/2026)</w:t>
       </w:r>
     </w:p>
     <w:p>
@@ -3309,19 +3303,7 @@
         <w:rPr>
           <w:color w:val="FF0000"/>
         </w:rPr>
-        <w:t>(</w:t>
-      </w:r>
-      <w:r>
-        <w:rPr>
-          <w:color w:val="FF0000"/>
-        </w:rPr>
-        <w:t>21</w:t>
-      </w:r>
-      <w:r>
-        <w:rPr>
-          <w:color w:val="FF0000"/>
-        </w:rPr>
-        <w:t>/3/2026)</w:t>
+        <w:t>(21/3/2026)</w:t>
       </w:r>
     </w:p>
     <w:p>
@@ -3339,7 +3321,57 @@
     </w:p>
     <w:p>
       <w:pPr>
-        <w:ind w:left="1440"/>
+        <w:pStyle w:val="ListParagraph"/>
+        <w:numPr>
+          <w:ilvl w:val="2"/>
+          <w:numId w:val="7"/>
+        </w:numPr>
+        <w:jc w:val="both"/>
+        <w:rPr>
+          <w:rFonts w:ascii="Times New Roman" w:hAnsi="Times New Roman" w:cs="Times New Roman"/>
+          <w:sz w:val="26"/>
+          <w:szCs w:val="26"/>
+        </w:rPr>
+      </w:pPr>
+      <w:r>
+        <w:rPr>
+          <w:rFonts w:ascii="Times New Roman" w:hAnsi="Times New Roman" w:cs="Times New Roman"/>
+          <w:sz w:val="26"/>
+          <w:szCs w:val="26"/>
+        </w:rPr>
+        <w:t>Thu thập ảnh chuẩn (nhưng đang hạn chế số lượng</w:t>
+      </w:r>
+    </w:p>
+    <w:p>
+      <w:pPr>
+        <w:pStyle w:val="ListParagraph"/>
+        <w:numPr>
+          <w:ilvl w:val="2"/>
+          <w:numId w:val="7"/>
+        </w:numPr>
+        <w:jc w:val="both"/>
+        <w:rPr>
+          <w:rFonts w:ascii="Times New Roman" w:hAnsi="Times New Roman" w:cs="Times New Roman"/>
+          <w:sz w:val="26"/>
+          <w:szCs w:val="26"/>
+        </w:rPr>
+      </w:pPr>
+      <w:r>
+        <w:rPr>
+          <w:rFonts w:ascii="Times New Roman" w:hAnsi="Times New Roman" w:cs="Times New Roman"/>
+          <w:sz w:val="26"/>
+          <w:szCs w:val="26"/>
+        </w:rPr>
+        <w:t xml:space="preserve">Tao database cho user sử dụng </w:t>
+      </w:r>
+    </w:p>
+    <w:p>
+      <w:pPr>
+        <w:pStyle w:val="ListParagraph"/>
+        <w:numPr>
+          <w:ilvl w:val="2"/>
+          <w:numId w:val="7"/>
+        </w:numPr>
         <w:jc w:val="both"/>
         <w:rPr>
           <w:rFonts w:ascii="Times New Roman" w:hAnsi="Times New Roman" w:cs="Times New Roman"/>
@@ -4640,7 +4672,7 @@
   <w:abstractNum w:abstractNumId="9" w15:restartNumberingAfterBreak="0">
     <w:nsid w:val="41B45D87"/>
     <w:multiLevelType w:val="multilevel"/>
-    <w:tmpl w:val="B8201FAA"/>
+    <w:tmpl w:val="6A6E751E"/>
     <w:lvl w:ilvl="0">
       <w:start w:val="1"/>
       <w:numFmt w:val="bullet"/>
@@ -4669,20 +4701,16 @@
         <w:ind w:left="1440" w:hanging="360"/>
       </w:pPr>
     </w:lvl>
-    <w:lvl w:ilvl="2" w:tentative="1">
-      <w:start w:val="1"/>
-      <w:numFmt w:val="bullet"/>
-      <w:lvlText w:val=""/>
-      <w:lvlJc w:val="left"/>
-      <w:pPr>
-        <w:tabs>
-          <w:tab w:val="num" w:pos="2160"/>
-        </w:tabs>
-        <w:ind w:left="2160" w:hanging="360"/>
-      </w:pPr>
-      <w:rPr>
-        <w:rFonts w:ascii="Wingdings" w:hAnsi="Wingdings" w:hint="default"/>
-        <w:sz w:val="20"/>
+    <w:lvl w:ilvl="2">
+      <w:start w:val="1"/>
+      <w:numFmt w:val="upperRoman"/>
+      <w:lvlText w:val="%3."/>
+      <w:lvlJc w:val="left"/>
+      <w:pPr>
+        <w:ind w:left="2520" w:hanging="720"/>
+      </w:pPr>
+      <w:rPr>
+        <w:rFonts w:hint="default"/>
       </w:rPr>
     </w:lvl>
     <w:lvl w:ilvl="3" w:tentative="1">

</xml_diff>